<commit_message>
corrigindo nomeclatura dos UCs
</commit_message>
<xml_diff>
--- a/documentação/Requisitos/UC14 - LISTAR PACIENTES.docx
+++ b/documentação/Requisitos/UC14 - LISTAR PACIENTES.docx
@@ -2525,7 +2525,21 @@
           <w:rFonts w:ascii="Segoe UI" w:hAnsi="Segoe UI" w:cs="Segoe UI"/>
           <w:color w:val="404040"/>
         </w:rPr>
-        <w:t>Ao clicar em um paciente, o sistema executa o UC-19 (Exibir Prontuário) para o paciente selecionado</w:t>
+        <w:t>Ao clicar em um paciente, o sistema executa o UC-1</w:t>
+      </w:r>
+      <w:r>
+        <w:rPr>
+          <w:rFonts w:ascii="Segoe UI" w:hAnsi="Segoe UI" w:cs="Segoe UI"/>
+          <w:color w:val="404040"/>
+        </w:rPr>
+        <w:t>3</w:t>
+      </w:r>
+      <w:r>
+        <w:rPr>
+          <w:rFonts w:ascii="Segoe UI" w:hAnsi="Segoe UI" w:cs="Segoe UI"/>
+          <w:color w:val="404040"/>
+        </w:rPr>
+        <w:t xml:space="preserve"> (Exibir Prontuário) para o paciente selecionado</w:t>
       </w:r>
     </w:p>
     <w:p>

</xml_diff>